<commit_message>
docs: enlazar la ejecución del CI del 30/10 en la segunda parte
</commit_message>
<xml_diff>
--- a/docs/Actividad 2 - Segunda parte - Documento técnico.docx
+++ b/docs/Actividad 2 - Segunda parte - Documento técnico.docx
@@ -6660,7 +6660,7 @@
           <w:noProof/>
         </w:rPr>
         <w:drawing>
-          <wp:inline distT="0" distB="0" distL="0" distR="0" wp14:anchorId="263098AD" wp14:editId="315DEB5B">
+          <wp:inline distT="0" distB="0" distL="0" distR="0" wp14:anchorId="5E10D56C" wp14:editId="46D86A13">
             <wp:extent cx="5220000" cy="2936250"/>
             <wp:effectExtent l="0" t="0" r="0" b="0"/>
             <wp:docPr id="1" name="Picture 1"/>
@@ -7379,7 +7379,7 @@
     </w:p>
     <w:p>
       <w:r>
-        <w:t>Para documentar la ejecución usamos una bitácora de pruebas. A diferencia del ejemplo de clase, los resultados no son simulados: ejecutamos las cuatro suites con scripts/ejecutar-pruebas.php el 30 de octubre de 2026 (Windows NT 10.0, PHP 8.4.27, PHPUnit 11.5.56, versión 0b43dae del repositorio).</w:t>
+        <w:t>Para documentar la ejecución usamos una bitácora de pruebas. A diferencia del ejemplo de clase, los resultados no son simulados: ejecutamos las cuatro suites con scripts/ejecutar-pruebas.php el 30 de octubre de 2026 (Windows NT 10.0, PHP 8.4.27, PHPUnit 11.5.56, versión fc95f31 del repositorio).</w:t>
       </w:r>
     </w:p>
     <w:p>
@@ -8790,7 +8790,7 @@
           <w:noProof/>
         </w:rPr>
         <w:drawing>
-          <wp:inline distT="0" distB="0" distL="0" distR="0" wp14:anchorId="7B1AD8F9" wp14:editId="5002BD45">
+          <wp:inline distT="0" distB="0" distL="0" distR="0" wp14:anchorId="776A2C92" wp14:editId="3F3CDCCB">
             <wp:extent cx="5580000" cy="3138750"/>
             <wp:effectExtent l="0" t="0" r="0" b="0"/>
             <wp:docPr id="2" name="Picture 2"/>
@@ -8849,7 +8849,7 @@
           <w:noProof/>
         </w:rPr>
         <w:drawing>
-          <wp:inline distT="0" distB="0" distL="0" distR="0" wp14:anchorId="1423E0CD" wp14:editId="3F73DF0E">
+          <wp:inline distT="0" distB="0" distL="0" distR="0" wp14:anchorId="1CEF260C" wp14:editId="1D936D15">
             <wp:extent cx="5580000" cy="3138750"/>
             <wp:effectExtent l="0" t="0" r="0" b="0"/>
             <wp:docPr id="3" name="Picture 3"/>
@@ -9500,7 +9500,7 @@
           <w:noProof/>
         </w:rPr>
         <w:drawing>
-          <wp:inline distT="0" distB="0" distL="0" distR="0" wp14:anchorId="5B40F9F8" wp14:editId="66C28FC9">
+          <wp:inline distT="0" distB="0" distL="0" distR="0" wp14:anchorId="3BCC867C" wp14:editId="3050244E">
             <wp:extent cx="5580000" cy="2650500"/>
             <wp:effectExtent l="0" t="0" r="0" b="0"/>
             <wp:docPr id="4" name="Picture 4"/>
@@ -10972,7 +10972,7 @@
           <w:noProof/>
         </w:rPr>
         <w:drawing>
-          <wp:inline distT="0" distB="0" distL="0" distR="0" wp14:anchorId="5112F30D" wp14:editId="5F031C2D">
+          <wp:inline distT="0" distB="0" distL="0" distR="0" wp14:anchorId="0D8D9556" wp14:editId="0BA6C549">
             <wp:extent cx="5220000" cy="2936250"/>
             <wp:effectExtent l="0" t="0" r="0" b="0"/>
             <wp:docPr id="5" name="Picture 5"/>
@@ -11362,7 +11362,7 @@
               <w:rPr>
                 <w:sz w:val="19"/>
               </w:rPr>
-              <w:t>Commit 0b43dae (rama main)</w:t>
+              <w:t>Commit fc95f31 (rama main)</w:t>
             </w:r>
           </w:p>
         </w:tc>
@@ -11379,7 +11379,7 @@
               <w:rPr>
                 <w:sz w:val="19"/>
               </w:rPr>
-              <w:t>Commit 0b43dae (rama main)</w:t>
+              <w:t>Commit fc95f31 (rama main)</w:t>
             </w:r>
           </w:p>
         </w:tc>
@@ -11729,7 +11729,7 @@
             <w:color w:val="1F4E8C"/>
             <w:u w:val="single"/>
           </w:rPr>
-          <w:t>https://github.com/azharsonix/sistema-inventario-actividad-2/actions/runs/40804500676</w:t>
+          <w:t>https://github.com/azharsonix/sistema-inventario-actividad-2/actions/runs/41169506352</w:t>
         </w:r>
       </w:hyperlink>
       <w:r>
@@ -12182,7 +12182,7 @@
           <w:noProof/>
         </w:rPr>
         <w:drawing>
-          <wp:inline distT="0" distB="0" distL="0" distR="0" wp14:anchorId="155CDE1D" wp14:editId="26C1CA5D">
+          <wp:inline distT="0" distB="0" distL="0" distR="0" wp14:anchorId="17EB281C" wp14:editId="336E828E">
             <wp:extent cx="5580000" cy="3138750"/>
             <wp:effectExtent l="0" t="0" r="0" b="0"/>
             <wp:docPr id="6" name="Picture 6"/>
@@ -12241,7 +12241,7 @@
           <w:noProof/>
         </w:rPr>
         <w:drawing>
-          <wp:inline distT="0" distB="0" distL="0" distR="0" wp14:anchorId="737D24BA" wp14:editId="22F6F6B2">
+          <wp:inline distT="0" distB="0" distL="0" distR="0" wp14:anchorId="319346E5" wp14:editId="7A1399B4">
             <wp:extent cx="5580000" cy="3138750"/>
             <wp:effectExtent l="0" t="0" r="0" b="0"/>
             <wp:docPr id="7" name="Picture 7"/>
@@ -14158,31 +14158,31 @@
       </w:rPr>
     </w:lvl>
   </w:abstractNum>
-  <w:num w:numId="1" w16cid:durableId="2020347396">
+  <w:num w:numId="1" w16cid:durableId="1301837091">
     <w:abstractNumId w:val="8"/>
   </w:num>
-  <w:num w:numId="2" w16cid:durableId="1352489884">
+  <w:num w:numId="2" w16cid:durableId="1210611494">
     <w:abstractNumId w:val="6"/>
   </w:num>
-  <w:num w:numId="3" w16cid:durableId="1903757967">
+  <w:num w:numId="3" w16cid:durableId="1998916934">
     <w:abstractNumId w:val="5"/>
   </w:num>
-  <w:num w:numId="4" w16cid:durableId="317150620">
+  <w:num w:numId="4" w16cid:durableId="1999645960">
     <w:abstractNumId w:val="4"/>
   </w:num>
-  <w:num w:numId="5" w16cid:durableId="537820314">
+  <w:num w:numId="5" w16cid:durableId="1504197649">
     <w:abstractNumId w:val="7"/>
   </w:num>
-  <w:num w:numId="6" w16cid:durableId="209611513">
+  <w:num w:numId="6" w16cid:durableId="84768092">
     <w:abstractNumId w:val="3"/>
   </w:num>
-  <w:num w:numId="7" w16cid:durableId="702362672">
+  <w:num w:numId="7" w16cid:durableId="510679891">
     <w:abstractNumId w:val="2"/>
   </w:num>
-  <w:num w:numId="8" w16cid:durableId="710376641">
+  <w:num w:numId="8" w16cid:durableId="2002196745">
     <w:abstractNumId w:val="1"/>
   </w:num>
-  <w:num w:numId="9" w16cid:durableId="1311135702">
+  <w:num w:numId="9" w16cid:durableId="1923635372">
     <w:abstractNumId w:val="0"/>
   </w:num>
 </w:numbering>

</xml_diff>